<commit_message>
Use simpler wording in SRS, SAD and Test Plan
- SRS (v1.2) and SAD (v1.1): shorter sentences and simpler words.
  No requirement or design decision was changed.
- Test Plan: same wording clean-up, plus unit test coverage of score.c.
- test_score.c: add a check for answers == NULL, so score.c now has
  100% line and branch coverage.
- Rebuild the .docx copies of the three documents.
</commit_message>
<xml_diff>
--- a/docs/SAD.docx
+++ b/docs/SAD.docx
@@ -33,7 +33,7 @@
         <w:t>Version:</w:t>
       </w:r>
       <w:r>
-        <w:t xml:space="preserve"> 1.0</w:t>
+        <w:t xml:space="preserve"> 1.1</w:t>
       </w:r>
     </w:p>
     <w:p>
@@ -220,6 +220,64 @@
           </w:p>
         </w:tc>
       </w:tr>
+      <w:tr>
+        <w:tc>
+          <w:tcPr>
+            <w:tcW w:type="dxa" w:w="2409"/>
+          </w:tcPr>
+          <w:p>
+            <w:r/>
+            <w:r>
+              <w:rPr>
+                <w:sz w:val="18"/>
+              </w:rPr>
+              <w:t>1.1</w:t>
+            </w:r>
+          </w:p>
+        </w:tc>
+        <w:tc>
+          <w:tcPr>
+            <w:tcW w:type="dxa" w:w="2409"/>
+          </w:tcPr>
+          <w:p>
+            <w:r/>
+            <w:r>
+              <w:rPr>
+                <w:sz w:val="18"/>
+              </w:rPr>
+              <w:t>12-10-2026</w:t>
+            </w:r>
+          </w:p>
+        </w:tc>
+        <w:tc>
+          <w:tcPr>
+            <w:tcW w:type="dxa" w:w="2409"/>
+          </w:tcPr>
+          <w:p>
+            <w:r/>
+            <w:r>
+              <w:rPr>
+                <w:sz w:val="18"/>
+              </w:rPr>
+              <w:t>Team</w:t>
+            </w:r>
+          </w:p>
+        </w:tc>
+        <w:tc>
+          <w:tcPr>
+            <w:tcW w:type="dxa" w:w="2409"/>
+          </w:tcPr>
+          <w:p>
+            <w:r/>
+            <w:r>
+              <w:rPr>
+                <w:sz w:val="18"/>
+              </w:rPr>
+              <w:t>Simplified the wording (no change to the design)</w:t>
+            </w:r>
+          </w:p>
+        </w:tc>
+      </w:tr>
     </w:tbl>
     <w:p/>
     <w:p>
@@ -463,7 +521,7 @@
     </w:p>
     <w:p>
       <w:r>
-        <w:t>This document specifies the architecture and design of the Online Quiz System, a console-based multiple-choice quiz application written in C. It explains how the requirements in the SRS (v1.1) are realised by components, interfaces and data flows, so that the four team members can implement their modules independently and the result can be tested against the Test Plan.</w:t>
+        <w:t>This document describes the architecture and design of the Online Quiz System, a console-based multiple-choice quiz program written in C. It shows how the requirements in the SRS (v1.2) are met by components, functions and data flow, so that the four team members can build their modules separately and test them against the Test Plan.</w:t>
       </w:r>
     </w:p>
     <w:p>
@@ -476,7 +534,7 @@
     </w:p>
     <w:p>
       <w:r>
-        <w:t>It covers the whole application: the main menu and navigation, the quiz engine, scoring and result display, and result storage with the leaderboard. It does not cover deployment (the program is a single local executable) or anything outside the SRS scope such as accounts, networking or a GUI.</w:t>
+        <w:t>It covers the whole program: the main menu, the quiz engine, scoring and result display, and result storage with the leaderboard. It does not cover deployment (the program is one local executable) or anything outside the SRS scope, such as accounts, networking or a GUI.</w:t>
       </w:r>
     </w:p>
     <w:p>
@@ -489,7 +547,7 @@
     </w:p>
     <w:p>
       <w:r>
-        <w:t>Developers implementing the modules, testers deriving test cases, the course evaluators, and anyone maintaining the project later.</w:t>
+        <w:t>Developers building the modules, testers writing test cases, the course evaluators, and anyone who works on the project later.</w:t>
       </w:r>
     </w:p>
     <w:p>
@@ -659,7 +717,7 @@
               <w:rPr>
                 <w:sz w:val="18"/>
               </w:rPr>
-              <w:t>Architecture decision record</w:t>
+              <w:t>Architecture decision record (a short note on a design choice and why it was made)</w:t>
             </w:r>
           </w:p>
         </w:tc>
@@ -689,7 +747,7 @@
               <w:rPr>
                 <w:sz w:val="18"/>
               </w:rPr>
-              <w:t>Threat categories: Spoofing, Tampering, Repudiation, Information disclosure, Denial of service, Elevation of privilege</w:t>
+              <w:t>A list of threat types: Spoofing (pretending to be someone), Tampering (changing data), Repudiation (denying an action), Information disclosure (showing private data), Denial of service (stopping the program from working), Elevation of privilege (getting rights you should not have)</w:t>
             </w:r>
           </w:p>
         </w:tc>
@@ -744,7 +802,7 @@
     </w:p>
     <w:p>
       <w:r>
-        <w:t>Section 3 describes the architecture (components, pattern, traceability, security). Section 4 describes the detailed design (sequence diagrams, function-level API, error handling, console UX). Developers should read 3.4 and 4.3 before touching a module; testers should read 3.8 and 4.4.</w:t>
+        <w:t>Section 3 describes the architecture (components, pattern, traceability to requirements, security). Section 4 describes the design (sequence diagrams, functions, error handling, screens). Developers should read 3.4 and 4.3 before changing a module. Testers should read 3.8 and 4.4.</w:t>
       </w:r>
     </w:p>
     <w:p>
@@ -810,7 +868,7 @@
               <w:rPr>
                 <w:sz w:val="18"/>
               </w:rPr>
-              <w:t>Software Requirements Specification v1.1</w:t>
+              <w:t>Software Requirements Specification v1.2</w:t>
             </w:r>
           </w:p>
         </w:tc>
@@ -961,7 +1019,7 @@
         <w:pStyle w:val="ListBullet"/>
       </w:pPr>
       <w:r>
-        <w:t>Let four people work in parallel without editing each other's files (NFR-5).</w:t>
+        <w:t>Let four people work at the same time without editing each other's files (NFR-5).</w:t>
       </w:r>
     </w:p>
     <w:p>
@@ -1018,7 +1076,7 @@
         <w:pStyle w:val="ListBullet"/>
       </w:pPr>
       <w:r>
-        <w:t>Persistence is limited to local flat text files.</w:t>
+        <w:t>Data is saved only in local text files.</w:t>
       </w:r>
     </w:p>
     <w:p>
@@ -1026,7 +1084,7 @@
         <w:pStyle w:val="ListBullet"/>
       </w:pPr>
       <w:r>
-        <w:t xml:space="preserve">The shared function signatures and structs in </w:t>
+        <w:t xml:space="preserve">The shared function names and structs in </w:t>
       </w:r>
       <w:r>
         <w:rPr>
@@ -1053,7 +1111,7 @@
         <w:t>storage.h</w:t>
       </w:r>
       <w:r>
-        <w:t xml:space="preserve"> are fixed so that modules can be developed in parallel.</w:t>
+        <w:t xml:space="preserve"> are fixed, so the modules can be built at the same time.</w:t>
       </w:r>
     </w:p>
     <w:p>
@@ -1163,7 +1221,7 @@
               <w:rPr>
                 <w:sz w:val="18"/>
               </w:rPr>
-              <w:t>Modularity, clear ownership, stable interfaces</w:t>
+              <w:t>Separate modules, clear ownership, function names that do not change</w:t>
             </w:r>
           </w:p>
         </w:tc>
@@ -1193,7 +1251,7 @@
               <w:rPr>
                 <w:sz w:val="18"/>
               </w:rPr>
-              <w:t>Observable behaviour, deterministic output, traceable requirements</w:t>
+              <w:t>Output that can be checked, requirements that can be traced to tests</w:t>
             </w:r>
           </w:p>
         </w:tc>
@@ -1223,7 +1281,7 @@
               <w:rPr>
                 <w:sz w:val="18"/>
               </w:rPr>
-              <w:t>Conformance to SRS, architecture and test documents; evidence of process</w:t>
+              <w:t>Code follows the SRS, SAD and Test Plan; proof of the process (commits, pull requests)</w:t>
             </w:r>
           </w:p>
         </w:tc>
@@ -1282,7 +1340,7 @@
         <w:rPr>
           <w:i/>
         </w:rPr>
-        <w:t>Figure 1: Components, provided interfaces and data stores.</w:t>
+        <w:t>Figure 1: Components, the functions each one offers, and the data files.</w:t>
       </w:r>
     </w:p>
     <w:p>
@@ -1352,7 +1410,7 @@
                 <w:b/>
                 <w:sz w:val="18"/>
               </w:rPr>
-              <w:t>Responsibility</w:t>
+              <w:t>What it does</w:t>
             </w:r>
           </w:p>
         </w:tc>
@@ -1368,7 +1426,7 @@
                 <w:b/>
                 <w:sz w:val="18"/>
               </w:rPr>
-              <w:t>Provided interface</w:t>
+              <w:t>Functions it offers</w:t>
             </w:r>
           </w:p>
         </w:tc>
@@ -1384,7 +1442,7 @@
                 <w:b/>
                 <w:sz w:val="18"/>
               </w:rPr>
-              <w:t>Uses</w:t>
+              <w:t>Depends on</w:t>
             </w:r>
           </w:p>
         </w:tc>
@@ -1445,7 +1503,7 @@
               <w:rPr>
                 <w:sz w:val="18"/>
               </w:rPr>
-              <w:t>Shows the menu, validates the menu choice, asks for the player name, routes to features, shows instructions, exits cleanly</w:t>
+              <w:t>Shows the menu, checks the menu choice, asks for the player name, calls the chosen feature, shows instructions, exits cleanly</w:t>
             </w:r>
           </w:p>
         </w:tc>
@@ -1545,7 +1603,7 @@
               <w:rPr>
                 <w:sz w:val="18"/>
               </w:rPr>
-              <w:t>Loads the question bank, presents one question at a time, validates and records each answer</w:t>
+              <w:t>Loads the question bank, shows one question at a time, checks and records each answer</w:t>
             </w:r>
           </w:p>
         </w:tc>
@@ -1673,7 +1731,7 @@
               <w:rPr>
                 <w:sz w:val="18"/>
               </w:rPr>
-              <w:t>Compares answers with correct options, counts correct/incorrect, computes percentage and Pass/Fail (40%), prints the result screen</w:t>
+              <w:t>Compares answers with the correct options, counts correct and incorrect answers, works out the percentage and Pass/Fail (40%), shows the result screen</w:t>
             </w:r>
           </w:p>
         </w:tc>
@@ -1814,7 +1872,7 @@
               <w:rPr>
                 <w:sz w:val="18"/>
               </w:rPr>
-              <w:t xml:space="preserve">Appends </w:t>
+              <w:t xml:space="preserve">Adds </w:t>
             </w:r>
             <w:r>
               <w:rPr>
@@ -1840,7 +1898,7 @@
               <w:rPr>
                 <w:sz w:val="18"/>
               </w:rPr>
-              <w:t>, reads results back, shows the leaderboard sorted high to low</w:t>
+              <w:t>, reads the results back, shows the leaderboard from high score to low</w:t>
             </w:r>
           </w:p>
         </w:tc>
@@ -2054,7 +2112,7 @@
               <w:rPr>
                 <w:sz w:val="18"/>
               </w:rPr>
-              <w:t xml:space="preserve"> (created at run time)</w:t>
+              <w:t xml:space="preserve"> (created when the program runs)</w:t>
             </w:r>
           </w:p>
         </w:tc>
@@ -2126,7 +2184,7 @@
     <w:p/>
     <w:p>
       <w:r>
-        <w:t xml:space="preserve">The only inter-module dependencies are on the two shared data types: </w:t>
+        <w:t xml:space="preserve">The only link between modules is the two shared data types: </w:t>
       </w:r>
       <w:r>
         <w:rPr>
@@ -2180,7 +2238,7 @@
         <w:t>Result</w:t>
       </w:r>
       <w:r>
-        <w:t>). No module calls another module's functions except through the Menu Controller, which orchestrates the flow.</w:t>
+        <w:t>). Modules do not call each other's functions. The Menu Controller calls them one after another.</w:t>
       </w:r>
     </w:p>
     <w:p>
@@ -2196,7 +2254,7 @@
         <w:rPr>
           <w:b/>
         </w:rPr>
-        <w:t>Pattern: layered architecture in a single process (modular monolith).</w:t>
+        <w:t>Pattern: layered architecture (one program made of separate modules).</w:t>
       </w:r>
     </w:p>
     <w:tbl>
@@ -2300,7 +2358,7 @@
               <w:rPr>
                 <w:sz w:val="18"/>
               </w:rPr>
-              <w:t>Talks to the user and calls the layers below; contains no scoring or file logic</w:t>
+              <w:t>Talks to the user and calls the layers below; has no scoring or file code</w:t>
             </w:r>
           </w:p>
         </w:tc>
@@ -2358,7 +2416,7 @@
               <w:rPr>
                 <w:sz w:val="18"/>
               </w:rPr>
-              <w:t>Quiz rules and scoring; no knowledge of the menu</w:t>
+              <w:t>Quiz rules and scoring; knows nothing about the menu</w:t>
             </w:r>
           </w:p>
         </w:tc>
@@ -2431,7 +2489,7 @@
         <w:t>Rationale.</w:t>
       </w:r>
       <w:r>
-        <w:t xml:space="preserve"> The program has one user, one process and three clearly separated concerns, which maps directly onto the team split. Layering gives each owner a file boundary (so pull requests do not clash), makes each module testable on its own (</w:t>
+        <w:t xml:space="preserve"> The program has one user, runs as one process, and has three clear parts, which match how the team shares the work. Layers give each owner their own files (so pull requests do not clash), let each module be tested alone (</w:t>
       </w:r>
       <w:r>
         <w:rPr>
@@ -2440,7 +2498,7 @@
         <w:t>tests/test_score.c</w:t>
       </w:r>
       <w:r>
-        <w:t xml:space="preserve"> links only </w:t>
+        <w:t xml:space="preserve"> uses only </w:t>
       </w:r>
       <w:r>
         <w:rPr>
@@ -2449,7 +2507,7 @@
         <w:t>score.c</w:t>
       </w:r>
       <w:r>
-        <w:t>), and keeps the menu from depending on file formats.</w:t>
+        <w:t>), and keep file-format details out of the menu code.</w:t>
       </w:r>
     </w:p>
     <w:p>
@@ -2529,7 +2587,7 @@
               <w:rPr>
                 <w:sz w:val="18"/>
               </w:rPr>
-              <w:t>There is no network, no second user and no deployment target; it would add complexity with no benefit</w:t>
+              <w:t>There is no network and no second user; it would only make the program more complicated</w:t>
             </w:r>
           </w:p>
         </w:tc>
@@ -2572,7 +2630,7 @@
               <w:rPr>
                 <w:sz w:val="18"/>
               </w:rPr>
-              <w:t>Four people editing one file; no isolated testing; violates NFR-5</w:t>
+              <w:t>Four people would edit one file; modules could not be tested alone; breaks NFR-5</w:t>
             </w:r>
           </w:p>
         </w:tc>
@@ -2602,7 +2660,7 @@
               <w:rPr>
                 <w:sz w:val="18"/>
               </w:rPr>
-              <w:t>Out of scope in the SRS (no database); a flat file is sufficient for a short leaderboard</w:t>
+              <w:t>The SRS says no database; a text file is enough for a short leaderboard</w:t>
             </w:r>
           </w:p>
         </w:tc>
@@ -2673,7 +2731,7 @@
                 <w:b/>
                 <w:sz w:val="18"/>
               </w:rPr>
-              <w:t>Consequence</w:t>
+              <w:t>Result</w:t>
             </w:r>
           </w:p>
         </w:tc>
@@ -2703,7 +2761,7 @@
               <w:rPr>
                 <w:sz w:val="18"/>
               </w:rPr>
-              <w:t>Layered modules, one source/header pair per feature</w:t>
+              <w:t>Layered modules, one source file and one header file per feature</w:t>
             </w:r>
           </w:p>
         </w:tc>
@@ -2717,7 +2775,7 @@
               <w:rPr>
                 <w:sz w:val="18"/>
               </w:rPr>
-              <w:t>Parallel work, per-module tests</w:t>
+              <w:t>Work at the same time, test each module alone</w:t>
             </w:r>
           </w:p>
         </w:tc>
@@ -2747,7 +2805,7 @@
               <w:rPr>
                 <w:sz w:val="18"/>
               </w:rPr>
-              <w:t>Flat text files for questions and results</w:t>
+              <w:t>Text files for questions and results</w:t>
             </w:r>
           </w:p>
         </w:tc>
@@ -2761,7 +2819,7 @@
               <w:rPr>
                 <w:sz w:val="18"/>
               </w:rPr>
-              <w:t>No dependencies; file is human-readable; no integrity protection (see 3.9)</w:t>
+              <w:t>No extra software needed; a person can read the file; nothing stops someone editing it (see 3.9)</w:t>
             </w:r>
           </w:p>
         </w:tc>
@@ -2791,7 +2849,7 @@
               <w:rPr>
                 <w:sz w:val="18"/>
               </w:rPr>
-              <w:t>Fixed, shared function signatures and structs</w:t>
+              <w:t>Shared function names and structs are fixed</w:t>
             </w:r>
           </w:p>
         </w:tc>
@@ -2805,7 +2863,7 @@
               <w:rPr>
                 <w:sz w:val="18"/>
               </w:rPr>
-              <w:t>Modules can be built before their dependencies exist (stubs)</w:t>
+              <w:t>A module can be built before the modules it depends on exist (stubs)</w:t>
             </w:r>
           </w:p>
         </w:tc>
@@ -2835,7 +2893,7 @@
               <w:rPr>
                 <w:sz w:val="18"/>
               </w:rPr>
-              <w:t>Caller-owned fixed-size buffers, no dynamic allocation</w:t>
+              <w:t>Fixed-size arrays created by the caller, no dynamic memory</w:t>
             </w:r>
           </w:p>
         </w:tc>
@@ -2849,7 +2907,7 @@
               <w:rPr>
                 <w:sz w:val="18"/>
               </w:rPr>
-              <w:t xml:space="preserve">No leaks or double-frees; the question limit is </w:t>
+              <w:t xml:space="preserve">No memory leaks; the question limit is </w:t>
             </w:r>
             <w:r>
               <w:rPr>
@@ -2913,7 +2971,7 @@
               <w:rPr>
                 <w:sz w:val="18"/>
               </w:rPr>
-              <w:t>Consistent UX (NFR-3); no logging framework needed</w:t>
+              <w:t>Screens look the same everywhere (NFR-3); no logging needed</w:t>
             </w:r>
           </w:p>
         </w:tc>
@@ -3340,7 +3398,7 @@
               <w:rPr>
                 <w:sz w:val="18"/>
               </w:rPr>
-              <w:t>Cannot demo end to end</w:t>
+              <w:t>Cannot demo the whole quiz</w:t>
             </w:r>
           </w:p>
         </w:tc>
@@ -3354,7 +3412,7 @@
               <w:rPr>
                 <w:sz w:val="18"/>
               </w:rPr>
-              <w:t xml:space="preserve">Stubs with the agreed signatures are on </w:t>
+              <w:t xml:space="preserve">Stubs (empty functions) with the agreed names are on </w:t>
             </w:r>
             <w:r>
               <w:rPr>
@@ -3383,7 +3441,7 @@
               <w:rPr>
                 <w:sz w:val="18"/>
               </w:rPr>
-              <w:t>Question file malformed or missing</w:t>
+              <w:t>Question file is in the wrong format or missing</w:t>
             </w:r>
           </w:p>
         </w:tc>
@@ -3498,7 +3556,7 @@
               <w:rPr>
                 <w:sz w:val="18"/>
               </w:rPr>
-              <w:t xml:space="preserve"> edited or corrupted by hand</w:t>
+              <w:t xml:space="preserve"> edited by hand or damaged</w:t>
             </w:r>
           </w:p>
         </w:tc>
@@ -3526,7 +3584,7 @@
               <w:rPr>
                 <w:sz w:val="18"/>
               </w:rPr>
-              <w:t>Reader skips malformed lines; documented as accepted residual risk (3.9)</w:t>
+              <w:t>Lines in the wrong format are skipped; the remaining risk is accepted (3.9)</w:t>
             </w:r>
           </w:p>
         </w:tc>
@@ -3576,7 +3634,7 @@
               <w:rPr>
                 <w:sz w:val="18"/>
               </w:rPr>
-              <w:t xml:space="preserve">Names ending in a stray </w:t>
+              <w:t xml:space="preserve">Names end with an extra </w:t>
             </w:r>
             <w:r>
               <w:rPr>
@@ -3597,7 +3655,7 @@
               <w:rPr>
                 <w:sz w:val="18"/>
               </w:rPr>
-              <w:t xml:space="preserve">Reader strips </w:t>
+              <w:t xml:space="preserve">The reader removes </w:t>
             </w:r>
             <w:r>
               <w:rPr>
@@ -3610,7 +3668,7 @@
               <w:rPr>
                 <w:sz w:val="18"/>
               </w:rPr>
-              <w:t xml:space="preserve"> before parsing</w:t>
+              <w:t xml:space="preserve"> before reading the line</w:t>
             </w:r>
           </w:p>
         </w:tc>
@@ -4269,7 +4327,7 @@
               <w:rPr>
                 <w:sz w:val="18"/>
               </w:rPr>
-              <w:t>REQ-12 Hand result to storage</w:t>
+              <w:t>REQ-12 Pass result to storage</w:t>
             </w:r>
           </w:p>
         </w:tc>
@@ -5030,16 +5088,7 @@
     </w:p>
     <w:p>
       <w:r>
-        <w:t xml:space="preserve">The system has no accounts, no network and no privileged operations. Its </w:t>
-      </w:r>
-      <w:r>
-        <w:rPr>
-          <w:b/>
-        </w:rPr>
-        <w:t>trust boundaries</w:t>
-      </w:r>
-      <w:r>
-        <w:t xml:space="preserve"> are (a) the keyboard, whose input is untrusted, and (b) the two local files, which any local user can edit.</w:t>
+        <w:t>The system has no accounts, no network and no special rights. Bad data can come in from two places: (a) the keyboard, which cannot be trusted, and (b) the two local files, which any user of the computer can edit.</w:t>
       </w:r>
     </w:p>
     <w:p>
@@ -5153,7 +5202,7 @@
               <w:rPr>
                 <w:sz w:val="18"/>
               </w:rPr>
-              <w:t>Entering someone else's name</w:t>
+              <w:t>Typing someone else's name</w:t>
             </w:r>
           </w:p>
         </w:tc>
@@ -5167,7 +5216,7 @@
               <w:rPr>
                 <w:sz w:val="18"/>
               </w:rPr>
-              <w:t>Not applicable: no authentication by design (single local user)</w:t>
+              <w:t>Not handled: there is no login by design (single local user)</w:t>
             </w:r>
           </w:p>
         </w:tc>
@@ -5211,7 +5260,7 @@
               <w:rPr>
                 <w:sz w:val="18"/>
               </w:rPr>
-              <w:t>A name containing a comma or newline corrupts the results file or forges another record</w:t>
+              <w:t>A name with a comma or new line damages the results file or fakes another record</w:t>
             </w:r>
           </w:p>
         </w:tc>
@@ -5251,7 +5300,7 @@
               <w:rPr>
                 <w:sz w:val="18"/>
               </w:rPr>
-              <w:t xml:space="preserve"> in the name are replaced by spaces before writing</w:t>
+              <w:t xml:space="preserve"> in the name are replaced by spaces before saving</w:t>
             </w:r>
           </w:p>
         </w:tc>
@@ -5295,7 +5344,7 @@
               <w:rPr>
                 <w:sz w:val="18"/>
               </w:rPr>
-              <w:t xml:space="preserve">Hand-editing </w:t>
+              <w:t xml:space="preserve">Editing </w:t>
             </w:r>
             <w:r>
               <w:rPr>
@@ -5304,6 +5353,12 @@
               </w:rPr>
               <w:t>results.txt</w:t>
             </w:r>
+            <w:r>
+              <w:rPr>
+                <w:sz w:val="18"/>
+              </w:rPr>
+              <w:t xml:space="preserve"> by hand</w:t>
+            </w:r>
           </w:p>
         </w:tc>
         <w:tc>
@@ -5316,7 +5371,7 @@
               <w:rPr>
                 <w:sz w:val="18"/>
               </w:rPr>
-              <w:t>Accepted residual risk; reader skips malformed lines</w:t>
+              <w:t>Risk accepted; lines in the wrong format are skipped</w:t>
             </w:r>
           </w:p>
         </w:tc>
@@ -5360,7 +5415,7 @@
               <w:rPr>
                 <w:sz w:val="18"/>
               </w:rPr>
-              <w:t>Denying a score</w:t>
+              <w:t>Someone denies their score</w:t>
             </w:r>
           </w:p>
         </w:tc>
@@ -5374,7 +5429,7 @@
               <w:rPr>
                 <w:sz w:val="18"/>
               </w:rPr>
-              <w:t>Not applicable for a local practice tool</w:t>
+              <w:t>Not needed for a local practice tool</w:t>
             </w:r>
           </w:p>
         </w:tc>
@@ -5412,7 +5467,7 @@
               <w:rPr>
                 <w:sz w:val="18"/>
               </w:rPr>
-              <w:t>Error text reveals paths or OS details</w:t>
+              <w:t>Error text shows paths or system details</w:t>
             </w:r>
           </w:p>
         </w:tc>
@@ -5426,7 +5481,7 @@
               <w:rPr>
                 <w:sz w:val="18"/>
               </w:rPr>
-              <w:t xml:space="preserve">Fixed one-line messages only; no </w:t>
+              <w:t xml:space="preserve">Only fixed one-line messages; no </w:t>
             </w:r>
             <w:r>
               <w:rPr>
@@ -5469,7 +5524,7 @@
               <w:rPr>
                 <w:sz w:val="18"/>
               </w:rPr>
-              <w:t>Denial of service / crash</w:t>
+              <w:t>Denial of service (crash)</w:t>
             </w:r>
           </w:p>
         </w:tc>
@@ -5483,7 +5538,7 @@
               <w:rPr>
                 <w:sz w:val="18"/>
               </w:rPr>
-              <w:t>Very long input, empty input, EOF, missing or unreadable file</w:t>
+              <w:t>Very long input, empty input, end of input, missing or unreadable file</w:t>
             </w:r>
           </w:p>
         </w:tc>
@@ -5497,7 +5552,7 @@
               <w:rPr>
                 <w:sz w:val="18"/>
               </w:rPr>
-              <w:t xml:space="preserve">Bounded </w:t>
+              <w:t xml:space="preserve">Size-limited </w:t>
             </w:r>
             <w:r>
               <w:rPr>
@@ -5510,7 +5565,7 @@
               <w:rPr>
                 <w:sz w:val="18"/>
               </w:rPr>
-              <w:t xml:space="preserve"> buffers, overflow discarded, EOF detected, every file call checked</w:t>
+              <w:t xml:space="preserve"> buffers, extra characters discarded, end of input detected, every file call checked</w:t>
             </w:r>
           </w:p>
         </w:tc>
@@ -5540,7 +5595,7 @@
               <w:rPr>
                 <w:sz w:val="18"/>
               </w:rPr>
-              <w:t>Memory safety</w:t>
+              <w:t>Buffer overflow</w:t>
             </w:r>
           </w:p>
         </w:tc>
@@ -5554,7 +5609,7 @@
               <w:rPr>
                 <w:sz w:val="18"/>
               </w:rPr>
-              <w:t>Buffer overflow via name or menu line</w:t>
+              <w:t>A long name or menu line writes past the end of a buffer</w:t>
             </w:r>
           </w:p>
         </w:tc>
@@ -5581,7 +5636,7 @@
               <w:rPr>
                 <w:sz w:val="18"/>
               </w:rPr>
-              <w:t xml:space="preserve"> with end-pointer validation</w:t>
+              <w:t xml:space="preserve"> with a check of the end pointer</w:t>
             </w:r>
           </w:p>
         </w:tc>
@@ -5625,7 +5680,7 @@
               <w:rPr>
                 <w:sz w:val="18"/>
               </w:rPr>
-              <w:t>Choosing an arbitrary file to read or write</w:t>
+              <w:t>Making the program open a file of the user's choice</w:t>
             </w:r>
           </w:p>
         </w:tc>
@@ -5639,7 +5694,7 @@
               <w:rPr>
                 <w:sz w:val="18"/>
               </w:rPr>
-              <w:t>File names are compile-time constants, never taken from input</w:t>
+              <w:t>File names are fixed in the code and never taken from input</w:t>
             </w:r>
           </w:p>
         </w:tc>
@@ -5670,7 +5725,7 @@
     </w:p>
     <w:p>
       <w:r>
-        <w:t>1. Read keyboard input only with bounded functions (</w:t>
+        <w:t>1. Read keyboard input only with functions that have a size limit (</w:t>
       </w:r>
       <w:r>
         <w:rPr>
@@ -5688,7 +5743,7 @@
         <w:t>gets</w:t>
       </w:r>
       <w:r>
-        <w:t xml:space="preserve"> or unbounded </w:t>
+        <w:t xml:space="preserve"> or </w:t>
       </w:r>
       <w:r>
         <w:rPr>
@@ -5697,12 +5752,12 @@
         <w:t>scanf("%s")</w:t>
       </w:r>
       <w:r>
-        <w:t>.</w:t>
+        <w:t xml:space="preserve"> without a limit.</w:t>
       </w:r>
     </w:p>
     <w:p>
       <w:r>
-        <w:t xml:space="preserve">2. Check the return value of every file operation and every </w:t>
+        <w:t xml:space="preserve">2. Check the result of every file call and every </w:t>
       </w:r>
       <w:r>
         <w:rPr>
@@ -5711,7 +5766,7 @@
         <w:t>NULL</w:t>
       </w:r>
       <w:r>
-        <w:t xml:space="preserve"> pointer argument.</w:t>
+        <w:t xml:space="preserve"> pointer.</w:t>
       </w:r>
     </w:p>
     <w:p>
@@ -5974,7 +6029,7 @@
         <w:t>char</w:t>
       </w:r>
       <w:r>
-        <w:t xml:space="preserve"> array, zero-filled so that unanswered questions never count as correct.</w:t>
+        <w:t xml:space="preserve"> array, set to zero first, so unanswered questions never count as correct.</w:t>
       </w:r>
     </w:p>
     <w:p>
@@ -6095,7 +6150,7 @@
     </w:p>
     <w:p>
       <w:r>
-        <w:t>All interfaces are C functions declared in the headers. There are no network endpoints.</w:t>
+        <w:t>All interfaces are C functions declared in the header files. There is no network.</w:t>
       </w:r>
     </w:p>
     <w:p>
@@ -6396,7 +6451,7 @@
               <w:rPr>
                 <w:sz w:val="18"/>
               </w:rPr>
-              <w:t>Postcondition</w:t>
+              <w:t>After the call</w:t>
             </w:r>
           </w:p>
         </w:tc>
@@ -6443,7 +6498,7 @@
               <w:rPr>
                 <w:sz w:val="18"/>
               </w:rPr>
-              <w:t xml:space="preserve"> for each answered question</w:t>
+              <w:t xml:space="preserve"> for each question that was answered</w:t>
             </w:r>
           </w:p>
         </w:tc>
@@ -6486,7 +6541,7 @@
               <w:rPr>
                 <w:sz w:val="18"/>
               </w:rPr>
-              <w:t xml:space="preserve"> line and asks again; end of input: returns with the remaining answers untouched (caller pre-zeroes the array)</w:t>
+              <w:t xml:space="preserve"> line and asks again; end of input: returns with the remaining answers untouched (the caller sets the array to zero first)</w:t>
             </w:r>
           </w:p>
         </w:tc>
@@ -6582,7 +6637,7 @@
               <w:rPr>
                 <w:sz w:val="18"/>
               </w:rPr>
-              <w:t>Mark the attempt</w:t>
+              <w:t>Check the answers and work out the result</w:t>
             </w:r>
           </w:p>
         </w:tc>
@@ -7239,7 +7294,7 @@
               <w:rPr>
                 <w:sz w:val="18"/>
               </w:rPr>
-              <w:t>File missing or unreadable: prints a short "no results yet" message and returns; malformed lines are skipped</w:t>
+              <w:t>File missing or unreadable: prints a short "no results yet" message and returns; lines in the wrong format are skipped</w:t>
             </w:r>
           </w:p>
         </w:tc>
@@ -7395,7 +7450,7 @@
     </w:p>
     <w:p>
       <w:r>
-        <w:t xml:space="preserve">Errors are reported as a single line beginning </w:t>
+        <w:t xml:space="preserve">Each error is shown as one line starting with </w:t>
       </w:r>
       <w:r>
         <w:rPr>
@@ -7404,7 +7459,7 @@
         <w:t>Error:</w:t>
       </w:r>
       <w:r>
-        <w:t xml:space="preserve"> on the console, followed by a return to a safe state. No error message contains a file name, path or system error code (SEC-1).</w:t>
+        <w:t>, and then the program goes back to a safe place (usually the menu). No error message contains a file name, path or system error code (SEC-1).</w:t>
       </w:r>
     </w:p>
     <w:tbl>
@@ -8290,7 +8345,7 @@
               <w:rPr>
                 <w:sz w:val="18"/>
               </w:rPr>
-              <w:t xml:space="preserve"> is malformed</w:t>
+              <w:t xml:space="preserve"> is in the wrong format</w:t>
             </w:r>
           </w:p>
         </w:tc>
@@ -8348,7 +8403,7 @@
         <w:t>Logging.</w:t>
       </w:r>
       <w:r>
-        <w:t xml:space="preserve"> A console quiz has no log file; adding one would create a second place where information could leak. Errors are visible on screen only.</w:t>
+        <w:t xml:space="preserve"> The quiz keeps no log file, because a log file would be one more place where information could leak. Errors are shown on the screen only.</w:t>
       </w:r>
     </w:p>
     <w:p>
@@ -8356,7 +8411,7 @@
         <w:rPr>
           <w:b/>
         </w:rPr>
-        <w:t>Monitoring and quality gates.</w:t>
+        <w:t>Monitoring and checks.</w:t>
       </w:r>
       <w:r>
         <w:t xml:space="preserve"> The GitHub Actions build runs on every push and pull request, and </w:t>
@@ -8829,7 +8884,7 @@
               <w:rPr>
                 <w:sz w:val="18"/>
               </w:rPr>
-              <w:t xml:space="preserve"> is passed; only name and score are persisted. Keep BR-4 as the stored format</w:t>
+              <w:t xml:space="preserve"> is passed; only name and score are saved. BR-4 stays as the saved format</w:t>
             </w:r>
           </w:p>
         </w:tc>
@@ -8859,7 +8914,7 @@
               <w:rPr>
                 <w:sz w:val="18"/>
               </w:rPr>
-              <w:t>Question file format is defined by the sample file but not yet by a loader</w:t>
+              <w:t>The question file format is shown only by the sample file; no loader code uses it yet</w:t>
             </w:r>
           </w:p>
         </w:tc>
@@ -8873,7 +8928,7 @@
               <w:rPr>
                 <w:sz w:val="18"/>
               </w:rPr>
-              <w:t>Sanjana documents the format in her pull request</w:t>
+              <w:t>Sanjana documents the format in the pull request</w:t>
             </w:r>
           </w:p>
         </w:tc>
@@ -8903,7 +8958,7 @@
               <w:rPr>
                 <w:sz w:val="18"/>
               </w:rPr>
-              <w:t>Ties on the leaderboard have no defined order</w:t>
+              <w:t>Equal scores have no set order on the leaderboard</w:t>
             </w:r>
           </w:p>
         </w:tc>
@@ -8917,7 +8972,7 @@
               <w:rPr>
                 <w:sz w:val="18"/>
               </w:rPr>
-              <w:t>Keep file order for equal scores (stable sort)</w:t>
+              <w:t>Keep the order they appear in the file</w:t>
             </w:r>
           </w:p>
         </w:tc>
@@ -8961,7 +9016,7 @@
               <w:rPr>
                 <w:sz w:val="18"/>
               </w:rPr>
-              <w:t>Acceptable for the project; revisit only if the bank grows</w:t>
+              <w:t>Enough for this project; review it only if the question bank grows</w:t>
             </w:r>
           </w:p>
         </w:tc>
@@ -8995,7 +9050,7 @@
         <w:t>Layered architecture</w:t>
       </w:r>
       <w:r>
-        <w:t xml:space="preserve"> (modules grouped so that upper layers call lower layers only), </w:t>
+        <w:t xml:space="preserve"> (modules are grouped in layers, and a layer only calls the layers below it), </w:t>
       </w:r>
       <w:r>
         <w:rPr>
@@ -9004,7 +9059,7 @@
         <w:t>Stub</w:t>
       </w:r>
       <w:r>
-        <w:t xml:space="preserve"> (a function with the final signature and no behaviour yet).</w:t>
+        <w:t xml:space="preserve"> (a function with the final name and arguments that does nothing yet).</w:t>
       </w:r>
     </w:p>
     <w:p>
@@ -9036,7 +9091,7 @@
         <w:pStyle w:val="ListBullet"/>
       </w:pPr>
       <w:r>
-        <w:t>Online Quiz System SRS v1.1 (</w:t>
+        <w:t>Online Quiz System SRS v1.2 (</w:t>
       </w:r>
       <w:r>
         <w:rPr>

</xml_diff>

<commit_message>
Add quiz flow: show questions, validate and record answers
Implement run_quiz() in quiz.c. It shows one question at a time with
options A to D, re-asks on invalid input, records each answer and ends
after the last question. Input that ends early stops the quiz cleanly.

Update Test Plan results (TC-10 to TC-12 now pass), SAD open issues
and README status.

Closes #44
Closes #45
Closes #46
Closes #47
Closes #48
</commit_message>
<xml_diff>
--- a/docs/SAD.docx
+++ b/docs/SAD.docx
@@ -3412,7 +3412,7 @@
               <w:rPr>
                 <w:sz w:val="18"/>
               </w:rPr>
-              <w:t xml:space="preserve">Stubs (empty functions) with the agreed names are on </w:t>
+              <w:t xml:space="preserve">Stubs (empty functions) with the agreed names were on </w:t>
             </w:r>
             <w:r>
               <w:rPr>
@@ -3425,7 +3425,7 @@
               <w:rPr>
                 <w:sz w:val="18"/>
               </w:rPr>
-              <w:t>; scoring and storage are tested on their own</w:t>
+              <w:t>; scoring and storage were tested on their own. Now resolved: the engine is merged</w:t>
             </w:r>
           </w:p>
         </w:tc>
@@ -8769,7 +8769,7 @@
               <w:rPr>
                 <w:sz w:val="18"/>
               </w:rPr>
-              <w:t>) is still a stub</w:t>
+              <w:t>)</w:t>
             </w:r>
           </w:p>
         </w:tc>
@@ -8783,7 +8783,7 @@
               <w:rPr>
                 <w:sz w:val="18"/>
               </w:rPr>
-              <w:t>Sprint-1, Sanjana (REQ-17 to REQ-22)</w:t>
+              <w:t>Done in Sprint-1 (REQ-17 to REQ-22); closed</w:t>
             </w:r>
           </w:p>
         </w:tc>
@@ -8914,7 +8914,7 @@
               <w:rPr>
                 <w:sz w:val="18"/>
               </w:rPr>
-              <w:t>The question file format is shown only by the sample file; no loader code uses it yet</w:t>
+              <w:t>The question file format is shown only by the sample file</w:t>
             </w:r>
           </w:p>
         </w:tc>
@@ -8926,9 +8926,16 @@
             <w:r/>
             <w:r>
               <w:rPr>
-                <w:sz w:val="18"/>
-              </w:rPr>
-              <w:t>Sanjana documents the format in the pull request</w:t>
+                <w:rFonts w:ascii="Consolas" w:hAnsi="Consolas" w:eastAsia="Consolas"/>
+                <w:sz w:val="18"/>
+              </w:rPr>
+              <w:t>load_questions</w:t>
+            </w:r>
+            <w:r>
+              <w:rPr>
+                <w:sz w:val="18"/>
+              </w:rPr>
+              <w:t xml:space="preserve"> reads 6 lines per question: text, options A to D, then the correct letter</w:t>
             </w:r>
           </w:p>
         </w:tc>

</xml_diff>